<commit_message>
day 10 home task and day 11 document
</commit_message>
<xml_diff>
--- a/10096255_Day10.docx
+++ b/10096255_Day10.docx
@@ -287,7 +287,2128 @@
         <w:br/>
         <w:t>Examples: MySQL, PostgreSQL, Oracle, SQL Server.</w:t>
       </w:r>
-    </w:p>
+      <w:r>
+        <w:br/>
+      </w:r>
+      <w:r>
+        <w:br/>
+      </w:r>
+      <w:r>
+        <w:t>Threads</w:t>
+      </w:r>
+    </w:p>
+    <w:p>
+      <w:r>
+        <w:t>Huddles</w:t>
+      </w:r>
+    </w:p>
+    <w:p>
+      <w:r>
+        <w:t>Directories</w:t>
+      </w:r>
+    </w:p>
+    <w:p>
+      <w:r>
+        <w:t>3 tasks left</w:t>
+      </w:r>
+    </w:p>
+    <w:p>
+      <w:r>
+        <w:t>Starred</w:t>
+      </w:r>
+    </w:p>
+    <w:p>
+      <w:r>
+        <w:t>Drag and drop important stuff here</w:t>
+      </w:r>
+    </w:p>
+    <w:p>
+      <w:r>
+        <w:t>External connections</w:t>
+      </w:r>
+    </w:p>
+    <w:p>
+      <w:proofErr w:type="spellStart"/>
+      <w:r>
+        <w:t>redhat</w:t>
+      </w:r>
+      <w:proofErr w:type="spellEnd"/>
+      <w:r>
+        <w:t>-</w:t>
+      </w:r>
+      <w:proofErr w:type="spellStart"/>
+      <w:r>
+        <w:t>ibm</w:t>
+      </w:r>
+      <w:proofErr w:type="spellEnd"/>
+      <w:r>
+        <w:t>-connector</w:t>
+      </w:r>
+    </w:p>
+    <w:p>
+      <w:r>
+        <w:t>Salesforce</w:t>
+      </w:r>
+    </w:p>
+    <w:p>
+      <w:r>
+        <w:t>Salesforce</w:t>
+      </w:r>
+    </w:p>
+    <w:p>
+      <w:r>
+        <w:t>Channels</w:t>
+      </w:r>
+    </w:p>
+    <w:p>
+      <w:r>
+        <w:t>announcements-slack-at-</w:t>
+      </w:r>
+      <w:proofErr w:type="spellStart"/>
+      <w:r>
+        <w:t>ibm</w:t>
+      </w:r>
+      <w:proofErr w:type="spellEnd"/>
+    </w:p>
+    <w:p>
+      <w:proofErr w:type="spellStart"/>
+      <w:r>
+        <w:t>bcit</w:t>
+      </w:r>
+      <w:proofErr w:type="spellEnd"/>
+      <w:r>
+        <w:t>-</w:t>
+      </w:r>
+      <w:proofErr w:type="spellStart"/>
+      <w:r>
+        <w:t>blr</w:t>
+      </w:r>
+      <w:proofErr w:type="spellEnd"/>
+      <w:r>
+        <w:t>-updates</w:t>
+      </w:r>
+    </w:p>
+    <w:p>
+      <w:proofErr w:type="spellStart"/>
+      <w:r>
+        <w:lastRenderedPageBreak/>
+        <w:t>cr</w:t>
+      </w:r>
+      <w:proofErr w:type="spellEnd"/>
+      <w:r>
+        <w:t>-group-ongoing-batches-</w:t>
+      </w:r>
+      <w:proofErr w:type="spellStart"/>
+      <w:r>
+        <w:t>mtp</w:t>
+      </w:r>
+      <w:proofErr w:type="spellEnd"/>
+    </w:p>
+    <w:p>
+      <w:proofErr w:type="spellStart"/>
+      <w:r>
+        <w:t>generalL&amp;K</w:t>
+      </w:r>
+      <w:proofErr w:type="spellEnd"/>
+      <w:r>
+        <w:t xml:space="preserve"> India Team</w:t>
+      </w:r>
+    </w:p>
+    <w:p>
+      <w:proofErr w:type="spellStart"/>
+      <w:r>
+        <w:t>generalGBS</w:t>
+      </w:r>
+      <w:proofErr w:type="spellEnd"/>
+      <w:r>
+        <w:t xml:space="preserve"> Hybrid Cloud Services</w:t>
+      </w:r>
+    </w:p>
+    <w:p>
+      <w:r>
+        <w:t>global-</w:t>
+      </w:r>
+      <w:proofErr w:type="spellStart"/>
+      <w:r>
+        <w:t>elh</w:t>
+      </w:r>
+      <w:proofErr w:type="spellEnd"/>
+      <w:r>
+        <w:t>-</w:t>
+      </w:r>
+      <w:proofErr w:type="spellStart"/>
+      <w:r>
+        <w:t>newhires</w:t>
+      </w:r>
+      <w:proofErr w:type="spellEnd"/>
+    </w:p>
+    <w:p>
+      <w:r>
+        <w:t>hello-</w:t>
+      </w:r>
+      <w:proofErr w:type="spellStart"/>
+      <w:r>
+        <w:t>ibm</w:t>
+      </w:r>
+      <w:proofErr w:type="spellEnd"/>
+    </w:p>
+    <w:p>
+      <w:proofErr w:type="spellStart"/>
+      <w:r>
+        <w:t>ibmconsulting</w:t>
+      </w:r>
+      <w:proofErr w:type="spellEnd"/>
+      <w:r>
+        <w:t>-associates-</w:t>
+      </w:r>
+      <w:proofErr w:type="spellStart"/>
+      <w:r>
+        <w:t>india</w:t>
+      </w:r>
+      <w:proofErr w:type="spellEnd"/>
+    </w:p>
+    <w:p>
+      <w:proofErr w:type="spellStart"/>
+      <w:r>
+        <w:t>lkindiaqueries</w:t>
+      </w:r>
+      <w:proofErr w:type="spellEnd"/>
+    </w:p>
+    <w:p>
+      <w:r>
+        <w:t>random</w:t>
+      </w:r>
+    </w:p>
+    <w:p>
+      <w:r>
+        <w:t>Direct messages</w:t>
+      </w:r>
+    </w:p>
+    <w:p>
+      <w:r>
+        <w:t>Md Ahsab Shiraz2</w:t>
+      </w:r>
+    </w:p>
+    <w:p>
+      <w:r>
+        <w:t>Pooja Bhardwaj</w:t>
+      </w:r>
+    </w:p>
+    <w:p>
+      <w:r>
+        <w:t>Vaibhav Tiwari</w:t>
+      </w:r>
+    </w:p>
+    <w:p>
+      <w:r>
+        <w:t>Daniel Anand PremRaj</w:t>
+      </w:r>
+    </w:p>
+    <w:p>
+      <w:proofErr w:type="spellStart"/>
+      <w:r>
+        <w:t>Mushkeen</w:t>
+      </w:r>
+      <w:proofErr w:type="spellEnd"/>
+      <w:r>
+        <w:t xml:space="preserve"> Taj Noor</w:t>
+      </w:r>
+    </w:p>
+    <w:p>
+      <w:r>
+        <w:t xml:space="preserve">Sujal </w:t>
+      </w:r>
+      <w:proofErr w:type="spellStart"/>
+      <w:r>
+        <w:t>Kumaryou</w:t>
+      </w:r>
+      <w:proofErr w:type="spellEnd"/>
+    </w:p>
+    <w:p>
+      <w:r>
+        <w:t>Add coworkers</w:t>
+      </w:r>
+    </w:p>
+    <w:p>
+      <w:r>
+        <w:t>Agents &amp; apps</w:t>
+      </w:r>
+    </w:p>
+    <w:p>
+      <w:proofErr w:type="spellStart"/>
+      <w:r>
+        <w:t>Slackbot</w:t>
+      </w:r>
+      <w:proofErr w:type="spellEnd"/>
+    </w:p>
+    <w:p>
+      <w:proofErr w:type="spellStart"/>
+      <w:r>
+        <w:t>AskDevices</w:t>
+      </w:r>
+      <w:proofErr w:type="spellEnd"/>
+    </w:p>
+    <w:p>
+      <w:r>
+        <w:t>New Bee</w:t>
+      </w:r>
+    </w:p>
+    <w:p>
+      <w:r>
+        <w:t>Slack</w:t>
+      </w:r>
+    </w:p>
+    <w:p>
+      <w:r>
+        <w:t>Welcome Bot</w:t>
+      </w:r>
+    </w:p>
+    <w:p>
+      <w:r>
+        <w:t>wfm_for_ibm_services_4</w:t>
+      </w:r>
+    </w:p>
+    <w:p>
+      <w:proofErr w:type="gramStart"/>
+      <w:r>
+        <w:t>Your</w:t>
+      </w:r>
+      <w:proofErr w:type="gramEnd"/>
+      <w:r>
+        <w:t xml:space="preserve"> Learning at IBM</w:t>
+      </w:r>
+    </w:p>
+    <w:p>
+      <w:r>
+        <w:t>Talk it out in real time</w:t>
+      </w:r>
+    </w:p>
+    <w:p>
+      <w:r>
+        <w:t>Have a quick chat, just like you would in an office. Huddles are voice first, so no need to be camera ready.</w:t>
+      </w:r>
+    </w:p>
+    <w:p>
+      <w:proofErr w:type="spellStart"/>
+      <w:r>
+        <w:t>CanvasListFolder</w:t>
+      </w:r>
+      <w:proofErr w:type="spellEnd"/>
+    </w:p>
+    <w:p>
+      <w:r>
+        <w:lastRenderedPageBreak/>
+        <w:t xml:space="preserve">This conversation is just between </w:t>
+      </w:r>
+      <w:hyperlink r:id="rId4" w:tgtFrame="_blank" w:history="1">
+        <w:r>
+          <w:rPr>
+            <w:rStyle w:val="Hyperlink"/>
+          </w:rPr>
+          <w:t>@Md Ahsab Shiraz</w:t>
+        </w:r>
+      </w:hyperlink>
+      <w:r>
+        <w:t xml:space="preserve"> and you. Check out their profile to learn more about them.</w:t>
+      </w:r>
+    </w:p>
+    <w:p>
+      <w:r>
+        <w:t xml:space="preserve">Md Ahsab </w:t>
+      </w:r>
+      <w:proofErr w:type="gramStart"/>
+      <w:r>
+        <w:t>Shiraz  [</w:t>
+      </w:r>
+      <w:proofErr w:type="gramEnd"/>
+      <w:r>
+        <w:t>4:13 PM]</w:t>
+      </w:r>
+    </w:p>
+    <w:p>
+      <w:proofErr w:type="spellStart"/>
+      <w:r>
+        <w:t>hlo</w:t>
+      </w:r>
+      <w:proofErr w:type="spellEnd"/>
+    </w:p>
+    <w:p/>
+    <w:p>
+      <w:r>
+        <w:t>[4:14 PM]</w:t>
+      </w:r>
+    </w:p>
+    <w:p>
+      <w:r>
+        <w:t>UML diagram.png </w:t>
+      </w:r>
+    </w:p>
+    <w:p>
+      <w:pPr>
+        <w:rPr>
+          <w:rStyle w:val="Hyperlink"/>
+        </w:rPr>
+      </w:pPr>
+      <w:r>
+        <w:fldChar w:fldCharType="begin"/>
+      </w:r>
+      <w:r>
+        <w:instrText>HYPERLINK "https://files.slack.com/files-pri/T27SFGS2W-F0BL4GGS2AY/uml_diagram.png"</w:instrText>
+      </w:r>
+      <w:r>
+        <w:fldChar w:fldCharType="separate"/>
+      </w:r>
+    </w:p>
+    <w:p>
+      <w:r>
+        <w:fldChar w:fldCharType="end"/>
+      </w:r>
+    </w:p>
+    <w:p>
+      <w:r>
+        <w:t xml:space="preserve">Sujal </w:t>
+      </w:r>
+      <w:proofErr w:type="gramStart"/>
+      <w:r>
+        <w:t>Kumar  [</w:t>
+      </w:r>
+      <w:proofErr w:type="gramEnd"/>
+      <w:r>
+        <w:t>9:31 AM]</w:t>
+      </w:r>
+    </w:p>
+    <w:p>
+      <w:r>
+        <w:t>&lt;?xml version="1.0" encoding="UTF-8"?&gt;</w:t>
+      </w:r>
+    </w:p>
+    <w:p>
+      <w:r>
+        <w:t xml:space="preserve">&lt;project </w:t>
+      </w:r>
+      <w:proofErr w:type="spellStart"/>
+      <w:r>
+        <w:t>xmlns</w:t>
+      </w:r>
+      <w:proofErr w:type="spellEnd"/>
+      <w:r>
+        <w:t>="</w:t>
+      </w:r>
+      <w:hyperlink r:id="rId5" w:tgtFrame="_blank" w:history="1">
+        <w:r>
+          <w:rPr>
+            <w:rStyle w:val="Hyperlink"/>
+          </w:rPr>
+          <w:t>http://maven.apache.org/POM/4.0.0</w:t>
+        </w:r>
+      </w:hyperlink>
+      <w:r>
+        <w:t xml:space="preserve">" </w:t>
+      </w:r>
+      <w:proofErr w:type="spellStart"/>
+      <w:proofErr w:type="gramStart"/>
+      <w:r>
+        <w:t>xmlns:xsi</w:t>
+      </w:r>
+      <w:proofErr w:type="spellEnd"/>
+      <w:proofErr w:type="gramEnd"/>
+      <w:r>
+        <w:t>="</w:t>
+      </w:r>
+      <w:hyperlink r:id="rId6" w:tgtFrame="_blank" w:history="1">
+        <w:r>
+          <w:rPr>
+            <w:rStyle w:val="Hyperlink"/>
+          </w:rPr>
+          <w:t>http://www.w3.org/2001/XMLSchema-instance</w:t>
+        </w:r>
+      </w:hyperlink>
+      <w:r>
+        <w:t>"</w:t>
+      </w:r>
+    </w:p>
+    <w:p>
+      <w:r>
+        <w:t xml:space="preserve">         </w:t>
+      </w:r>
+      <w:proofErr w:type="spellStart"/>
+      <w:proofErr w:type="gramStart"/>
+      <w:r>
+        <w:t>xsi:schemaLocation</w:t>
+      </w:r>
+      <w:proofErr w:type="spellEnd"/>
+      <w:proofErr w:type="gramEnd"/>
+      <w:r>
+        <w:t>="</w:t>
+      </w:r>
+      <w:hyperlink r:id="rId7" w:tgtFrame="_blank" w:history="1">
+        <w:r>
+          <w:rPr>
+            <w:rStyle w:val="Hyperlink"/>
+          </w:rPr>
+          <w:t>http://maven.apache.org/POM/4.0.0</w:t>
+        </w:r>
+      </w:hyperlink>
+      <w:r>
+        <w:t xml:space="preserve"> </w:t>
+      </w:r>
+      <w:hyperlink r:id="rId8" w:tgtFrame="_blank" w:history="1">
+        <w:r>
+          <w:rPr>
+            <w:rStyle w:val="Hyperlink"/>
+          </w:rPr>
+          <w:t>https://maven.apache.org/xsd/maven-4.0.0.xsd</w:t>
+        </w:r>
+      </w:hyperlink>
+      <w:r>
+        <w:t>"&gt;</w:t>
+      </w:r>
+    </w:p>
+    <w:p>
+      <w:r>
+        <w:t xml:space="preserve">    &lt;</w:t>
+      </w:r>
+      <w:proofErr w:type="spellStart"/>
+      <w:r>
+        <w:t>modelVersion</w:t>
+      </w:r>
+      <w:proofErr w:type="spellEnd"/>
+      <w:r>
+        <w:t>&gt;4.0.0&lt;/</w:t>
+      </w:r>
+      <w:proofErr w:type="spellStart"/>
+      <w:r>
+        <w:t>modelVersion</w:t>
+      </w:r>
+      <w:proofErr w:type="spellEnd"/>
+      <w:r>
+        <w:t>&gt;</w:t>
+      </w:r>
+    </w:p>
+    <w:p>
+      <w:r>
+        <w:t xml:space="preserve">    &lt;parent&gt;</w:t>
+      </w:r>
+    </w:p>
+    <w:p>
+      <w:r>
+        <w:t xml:space="preserve">        </w:t>
+      </w:r>
+      <w:proofErr w:type="gramStart"/>
+      <w:r>
+        <w:t>&lt;</w:t>
+      </w:r>
+      <w:proofErr w:type="spellStart"/>
+      <w:r>
+        <w:t>groupId</w:t>
+      </w:r>
+      <w:proofErr w:type="spellEnd"/>
+      <w:r>
+        <w:t>&gt;</w:t>
+      </w:r>
+      <w:proofErr w:type="spellStart"/>
+      <w:r>
+        <w:t>org.springframework.boot</w:t>
+      </w:r>
+      <w:proofErr w:type="spellEnd"/>
+      <w:proofErr w:type="gramEnd"/>
+      <w:r>
+        <w:t>&lt;/</w:t>
+      </w:r>
+      <w:proofErr w:type="spellStart"/>
+      <w:r>
+        <w:t>groupId</w:t>
+      </w:r>
+      <w:proofErr w:type="spellEnd"/>
+      <w:r>
+        <w:t>&gt;</w:t>
+      </w:r>
+    </w:p>
+    <w:p>
+      <w:r>
+        <w:t xml:space="preserve">        &lt;</w:t>
+      </w:r>
+      <w:proofErr w:type="spellStart"/>
+      <w:r>
+        <w:t>artifactId</w:t>
+      </w:r>
+      <w:proofErr w:type="spellEnd"/>
+      <w:r>
+        <w:t>&gt;spring-boot-starter-parent&lt;/</w:t>
+      </w:r>
+      <w:proofErr w:type="spellStart"/>
+      <w:r>
+        <w:t>artifactId</w:t>
+      </w:r>
+      <w:proofErr w:type="spellEnd"/>
+      <w:r>
+        <w:t>&gt;</w:t>
+      </w:r>
+    </w:p>
+    <w:p>
+      <w:r>
+        <w:t xml:space="preserve">        &lt;version&gt;4.1.0&lt;/version&gt;</w:t>
+      </w:r>
+    </w:p>
+    <w:p>
+      <w:r>
+        <w:t xml:space="preserve">        &lt;</w:t>
+      </w:r>
+      <w:proofErr w:type="spellStart"/>
+      <w:r>
+        <w:t>relativePath</w:t>
+      </w:r>
+      <w:proofErr w:type="spellEnd"/>
+      <w:r>
+        <w:t xml:space="preserve">/&gt; </w:t>
+      </w:r>
+      <w:proofErr w:type="gramStart"/>
+      <w:r>
+        <w:t>&lt;!--</w:t>
+      </w:r>
+      <w:proofErr w:type="gramEnd"/>
+      <w:r>
+        <w:t xml:space="preserve"> lookup parent from repository --&gt;</w:t>
+      </w:r>
+    </w:p>
+    <w:p>
+      <w:r>
+        <w:t xml:space="preserve">    &lt;/parent&gt;</w:t>
+      </w:r>
+    </w:p>
+    <w:p>
+      <w:r>
+        <w:t xml:space="preserve">    &lt;</w:t>
+      </w:r>
+      <w:proofErr w:type="spellStart"/>
+      <w:r>
+        <w:t>groupId</w:t>
+      </w:r>
+      <w:proofErr w:type="spellEnd"/>
+      <w:r>
+        <w:t>&gt;</w:t>
+      </w:r>
+      <w:proofErr w:type="spellStart"/>
+      <w:r>
+        <w:t>com.sujal</w:t>
+      </w:r>
+      <w:proofErr w:type="spellEnd"/>
+      <w:r>
+        <w:t>&lt;/</w:t>
+      </w:r>
+      <w:proofErr w:type="spellStart"/>
+      <w:r>
+        <w:t>groupId</w:t>
+      </w:r>
+      <w:proofErr w:type="spellEnd"/>
+      <w:r>
+        <w:t>&gt;</w:t>
+      </w:r>
+    </w:p>
+    <w:p>
+      <w:r>
+        <w:t xml:space="preserve">    &lt;</w:t>
+      </w:r>
+      <w:proofErr w:type="spellStart"/>
+      <w:r>
+        <w:t>artifactId</w:t>
+      </w:r>
+      <w:proofErr w:type="spellEnd"/>
+      <w:r>
+        <w:t>&gt;Demo1_SpringFW&lt;/</w:t>
+      </w:r>
+      <w:proofErr w:type="spellStart"/>
+      <w:r>
+        <w:t>artifactId</w:t>
+      </w:r>
+      <w:proofErr w:type="spellEnd"/>
+      <w:r>
+        <w:t>&gt;</w:t>
+      </w:r>
+    </w:p>
+    <w:p>
+      <w:r>
+        <w:t xml:space="preserve">    &lt;version&gt;0.0.1-SNAPSHOT&lt;/version&gt;</w:t>
+      </w:r>
+    </w:p>
+    <w:p>
+      <w:r>
+        <w:t xml:space="preserve">    &lt;name&gt;Demo1_SpringFW&lt;/name&gt;</w:t>
+      </w:r>
+    </w:p>
+    <w:p>
+      <w:r>
+        <w:t xml:space="preserve">    &lt;description&gt;Demo1_SpringFW&lt;/description&gt;</w:t>
+      </w:r>
+    </w:p>
+    <w:p>
+      <w:r>
+        <w:t xml:space="preserve">    &lt;</w:t>
+      </w:r>
+      <w:proofErr w:type="spellStart"/>
+      <w:r>
+        <w:t>url</w:t>
+      </w:r>
+      <w:proofErr w:type="spellEnd"/>
+      <w:r>
+        <w:t>/&gt;</w:t>
+      </w:r>
+    </w:p>
+    <w:p>
+      <w:r>
+        <w:t xml:space="preserve">    &lt;licenses&gt;</w:t>
+      </w:r>
+    </w:p>
+    <w:p>
+      <w:r>
+        <w:lastRenderedPageBreak/>
+        <w:t xml:space="preserve">        &lt;license/&gt;</w:t>
+      </w:r>
+    </w:p>
+    <w:p>
+      <w:r>
+        <w:t xml:space="preserve">    &lt;/licenses&gt;</w:t>
+      </w:r>
+    </w:p>
+    <w:p>
+      <w:r>
+        <w:t xml:space="preserve">    &lt;developers&gt;</w:t>
+      </w:r>
+    </w:p>
+    <w:p>
+      <w:r>
+        <w:t xml:space="preserve">        &lt;developer/&gt;</w:t>
+      </w:r>
+    </w:p>
+    <w:p>
+      <w:r>
+        <w:t xml:space="preserve">    &lt;/developers&gt;</w:t>
+      </w:r>
+    </w:p>
+    <w:p>
+      <w:r>
+        <w:t xml:space="preserve">    &lt;</w:t>
+      </w:r>
+      <w:proofErr w:type="spellStart"/>
+      <w:r>
+        <w:t>scm</w:t>
+      </w:r>
+      <w:proofErr w:type="spellEnd"/>
+      <w:r>
+        <w:t>&gt;</w:t>
+      </w:r>
+    </w:p>
+    <w:p>
+      <w:r>
+        <w:t xml:space="preserve">        &lt;connection/&gt;</w:t>
+      </w:r>
+    </w:p>
+    <w:p>
+      <w:r>
+        <w:t xml:space="preserve">        &lt;</w:t>
+      </w:r>
+      <w:proofErr w:type="spellStart"/>
+      <w:r>
+        <w:t>developerConnection</w:t>
+      </w:r>
+      <w:proofErr w:type="spellEnd"/>
+      <w:r>
+        <w:t>/&gt;</w:t>
+      </w:r>
+    </w:p>
+    <w:p>
+      <w:r>
+        <w:t xml:space="preserve">        &lt;tag/&gt;</w:t>
+      </w:r>
+    </w:p>
+    <w:p>
+      <w:r>
+        <w:t xml:space="preserve">        &lt;</w:t>
+      </w:r>
+      <w:proofErr w:type="spellStart"/>
+      <w:r>
+        <w:t>url</w:t>
+      </w:r>
+      <w:proofErr w:type="spellEnd"/>
+      <w:r>
+        <w:t>/&gt;</w:t>
+      </w:r>
+    </w:p>
+    <w:p>
+      <w:r>
+        <w:t xml:space="preserve">    &lt;/</w:t>
+      </w:r>
+      <w:proofErr w:type="spellStart"/>
+      <w:r>
+        <w:t>scm</w:t>
+      </w:r>
+      <w:proofErr w:type="spellEnd"/>
+      <w:r>
+        <w:t>&gt;</w:t>
+      </w:r>
+    </w:p>
+    <w:p>
+      <w:r>
+        <w:t xml:space="preserve">    &lt;properties&gt;</w:t>
+      </w:r>
+    </w:p>
+    <w:p>
+      <w:r>
+        <w:t xml:space="preserve">        &lt;</w:t>
+      </w:r>
+      <w:proofErr w:type="spellStart"/>
+      <w:proofErr w:type="gramStart"/>
+      <w:r>
+        <w:t>java.version</w:t>
+      </w:r>
+      <w:proofErr w:type="spellEnd"/>
+      <w:proofErr w:type="gramEnd"/>
+      <w:r>
+        <w:t>&gt;17&lt;/</w:t>
+      </w:r>
+      <w:proofErr w:type="spellStart"/>
+      <w:proofErr w:type="gramStart"/>
+      <w:r>
+        <w:t>java.version</w:t>
+      </w:r>
+      <w:proofErr w:type="spellEnd"/>
+      <w:proofErr w:type="gramEnd"/>
+      <w:r>
+        <w:t>&gt;</w:t>
+      </w:r>
+    </w:p>
+    <w:p>
+      <w:r>
+        <w:t xml:space="preserve">    &lt;/properties&gt;</w:t>
+      </w:r>
+    </w:p>
+    <w:p>
+      <w:r>
+        <w:t xml:space="preserve">    &lt;dependencies&gt;</w:t>
+      </w:r>
+    </w:p>
+    <w:p>
+      <w:r>
+        <w:t xml:space="preserve">        &lt;dependency&gt;</w:t>
+      </w:r>
+    </w:p>
+    <w:p>
+      <w:r>
+        <w:t xml:space="preserve">            </w:t>
+      </w:r>
+      <w:proofErr w:type="gramStart"/>
+      <w:r>
+        <w:t>&lt;</w:t>
+      </w:r>
+      <w:proofErr w:type="spellStart"/>
+      <w:r>
+        <w:t>groupId</w:t>
+      </w:r>
+      <w:proofErr w:type="spellEnd"/>
+      <w:r>
+        <w:t>&gt;</w:t>
+      </w:r>
+      <w:proofErr w:type="spellStart"/>
+      <w:r>
+        <w:t>org.springframework.boot</w:t>
+      </w:r>
+      <w:proofErr w:type="spellEnd"/>
+      <w:proofErr w:type="gramEnd"/>
+      <w:r>
+        <w:t>&lt;/</w:t>
+      </w:r>
+      <w:proofErr w:type="spellStart"/>
+      <w:r>
+        <w:t>groupId</w:t>
+      </w:r>
+      <w:proofErr w:type="spellEnd"/>
+      <w:r>
+        <w:t>&gt;</w:t>
+      </w:r>
+    </w:p>
+    <w:p>
+      <w:r>
+        <w:t xml:space="preserve">            &lt;</w:t>
+      </w:r>
+      <w:proofErr w:type="spellStart"/>
+      <w:r>
+        <w:t>artifactId</w:t>
+      </w:r>
+      <w:proofErr w:type="spellEnd"/>
+      <w:r>
+        <w:t>&gt;spring-boot-starter-</w:t>
+      </w:r>
+      <w:proofErr w:type="spellStart"/>
+      <w:r>
+        <w:t>webmvc</w:t>
+      </w:r>
+      <w:proofErr w:type="spellEnd"/>
+      <w:r>
+        <w:t>&lt;/</w:t>
+      </w:r>
+      <w:proofErr w:type="spellStart"/>
+      <w:r>
+        <w:t>artifactId</w:t>
+      </w:r>
+      <w:proofErr w:type="spellEnd"/>
+      <w:r>
+        <w:t>&gt;</w:t>
+      </w:r>
+    </w:p>
+    <w:p>
+      <w:r>
+        <w:t xml:space="preserve">        &lt;/dependency&gt;</w:t>
+      </w:r>
+    </w:p>
+    <w:p/>
+    <w:p>
+      <w:r>
+        <w:t xml:space="preserve">        &lt;dependency&gt;</w:t>
+      </w:r>
+    </w:p>
+    <w:p>
+      <w:r>
+        <w:t xml:space="preserve">            </w:t>
+      </w:r>
+      <w:proofErr w:type="gramStart"/>
+      <w:r>
+        <w:t>&lt;</w:t>
+      </w:r>
+      <w:proofErr w:type="spellStart"/>
+      <w:r>
+        <w:t>groupId</w:t>
+      </w:r>
+      <w:proofErr w:type="spellEnd"/>
+      <w:r>
+        <w:t>&gt;</w:t>
+      </w:r>
+      <w:proofErr w:type="spellStart"/>
+      <w:r>
+        <w:t>org.springframework.boot</w:t>
+      </w:r>
+      <w:proofErr w:type="spellEnd"/>
+      <w:proofErr w:type="gramEnd"/>
+      <w:r>
+        <w:t>&lt;/</w:t>
+      </w:r>
+      <w:proofErr w:type="spellStart"/>
+      <w:r>
+        <w:t>groupId</w:t>
+      </w:r>
+      <w:proofErr w:type="spellEnd"/>
+      <w:r>
+        <w:t>&gt;</w:t>
+      </w:r>
+    </w:p>
+    <w:p>
+      <w:r>
+        <w:t xml:space="preserve">            &lt;</w:t>
+      </w:r>
+      <w:proofErr w:type="spellStart"/>
+      <w:r>
+        <w:t>artifactId</w:t>
+      </w:r>
+      <w:proofErr w:type="spellEnd"/>
+      <w:r>
+        <w:t>&gt;spring-boot-starter-</w:t>
+      </w:r>
+      <w:proofErr w:type="spellStart"/>
+      <w:r>
+        <w:t>webmvc</w:t>
+      </w:r>
+      <w:proofErr w:type="spellEnd"/>
+      <w:r>
+        <w:t>-test&lt;/</w:t>
+      </w:r>
+      <w:proofErr w:type="spellStart"/>
+      <w:r>
+        <w:t>artifactId</w:t>
+      </w:r>
+      <w:proofErr w:type="spellEnd"/>
+      <w:r>
+        <w:t>&gt;</w:t>
+      </w:r>
+    </w:p>
+    <w:p>
+      <w:r>
+        <w:t xml:space="preserve">            &lt;scope&gt;test&lt;/scope&gt;</w:t>
+      </w:r>
+    </w:p>
+    <w:p>
+      <w:r>
+        <w:t xml:space="preserve">        &lt;/dependency&gt;</w:t>
+      </w:r>
+    </w:p>
+    <w:p>
+      <w:r>
+        <w:t xml:space="preserve">    &lt;/dependencies&gt;</w:t>
+      </w:r>
+    </w:p>
+    <w:p/>
+    <w:p>
+      <w:r>
+        <w:t xml:space="preserve">    &lt;build&gt;</w:t>
+      </w:r>
+    </w:p>
+    <w:p>
+      <w:r>
+        <w:lastRenderedPageBreak/>
+        <w:t xml:space="preserve">        &lt;plugins&gt;</w:t>
+      </w:r>
+    </w:p>
+    <w:p>
+      <w:r>
+        <w:t xml:space="preserve">            &lt;plugin&gt;</w:t>
+      </w:r>
+    </w:p>
+    <w:p>
+      <w:r>
+        <w:t xml:space="preserve">                </w:t>
+      </w:r>
+      <w:proofErr w:type="gramStart"/>
+      <w:r>
+        <w:t>&lt;</w:t>
+      </w:r>
+      <w:proofErr w:type="spellStart"/>
+      <w:r>
+        <w:t>groupId</w:t>
+      </w:r>
+      <w:proofErr w:type="spellEnd"/>
+      <w:r>
+        <w:t>&gt;</w:t>
+      </w:r>
+      <w:proofErr w:type="spellStart"/>
+      <w:r>
+        <w:t>org.springframework.boot</w:t>
+      </w:r>
+      <w:proofErr w:type="spellEnd"/>
+      <w:proofErr w:type="gramEnd"/>
+      <w:r>
+        <w:t>&lt;/</w:t>
+      </w:r>
+      <w:proofErr w:type="spellStart"/>
+      <w:r>
+        <w:t>groupId</w:t>
+      </w:r>
+      <w:proofErr w:type="spellEnd"/>
+      <w:r>
+        <w:t>&gt;</w:t>
+      </w:r>
+    </w:p>
+    <w:p>
+      <w:r>
+        <w:t xml:space="preserve">                &lt;</w:t>
+      </w:r>
+      <w:proofErr w:type="spellStart"/>
+      <w:r>
+        <w:t>artifactId</w:t>
+      </w:r>
+      <w:proofErr w:type="spellEnd"/>
+      <w:r>
+        <w:t>&gt;spring-boot-maven-plugin&lt;/</w:t>
+      </w:r>
+      <w:proofErr w:type="spellStart"/>
+      <w:r>
+        <w:t>artifactId</w:t>
+      </w:r>
+      <w:proofErr w:type="spellEnd"/>
+      <w:r>
+        <w:t>&gt;</w:t>
+      </w:r>
+    </w:p>
+    <w:p>
+      <w:r>
+        <w:t xml:space="preserve">            &lt;/plugin&gt;</w:t>
+      </w:r>
+    </w:p>
+    <w:p>
+      <w:r>
+        <w:t xml:space="preserve">        &lt;/plugins&gt;</w:t>
+      </w:r>
+    </w:p>
+    <w:p>
+      <w:r>
+        <w:t xml:space="preserve">    &lt;/build&gt;</w:t>
+      </w:r>
+    </w:p>
+    <w:p/>
+    <w:p>
+      <w:r>
+        <w:t>&lt;/project&gt;</w:t>
+      </w:r>
+    </w:p>
+    <w:p>
+      <w:r>
+        <w:t xml:space="preserve">Md Ahsab </w:t>
+      </w:r>
+      <w:proofErr w:type="gramStart"/>
+      <w:r>
+        <w:t>Shiraz  [</w:t>
+      </w:r>
+      <w:proofErr w:type="gramEnd"/>
+      <w:r>
+        <w:t>2:54 PM]</w:t>
+      </w:r>
+    </w:p>
+    <w:p>
+      <w:proofErr w:type="spellStart"/>
+      <w:r>
+        <w:t>mvn</w:t>
+      </w:r>
+      <w:proofErr w:type="spellEnd"/>
+      <w:r>
+        <w:t xml:space="preserve"> </w:t>
+      </w:r>
+      <w:proofErr w:type="spellStart"/>
+      <w:r>
+        <w:t>spring-</w:t>
+      </w:r>
+      <w:proofErr w:type="gramStart"/>
+      <w:r>
+        <w:t>boot:run</w:t>
+      </w:r>
+      <w:proofErr w:type="spellEnd"/>
+      <w:proofErr w:type="gramEnd"/>
+      <w:r>
+        <w:t xml:space="preserve"> -</w:t>
+      </w:r>
+      <w:proofErr w:type="spellStart"/>
+      <w:r>
+        <w:t>Dspring-boot.run.arguments</w:t>
+      </w:r>
+      <w:proofErr w:type="spellEnd"/>
+      <w:r>
+        <w:t>="--</w:t>
+      </w:r>
+      <w:proofErr w:type="spellStart"/>
+      <w:proofErr w:type="gramStart"/>
+      <w:r>
+        <w:t>server.port</w:t>
+      </w:r>
+      <w:proofErr w:type="spellEnd"/>
+      <w:proofErr w:type="gramEnd"/>
+      <w:r>
+        <w:t>=9090"</w:t>
+      </w:r>
+    </w:p>
+    <w:p>
+      <w:r>
+        <w:t xml:space="preserve">Md Ahsab </w:t>
+      </w:r>
+      <w:proofErr w:type="gramStart"/>
+      <w:r>
+        <w:t>Shiraz  [</w:t>
+      </w:r>
+      <w:proofErr w:type="gramEnd"/>
+      <w:r>
+        <w:t>4:09 PM]</w:t>
+      </w:r>
+    </w:p>
+    <w:p>
+      <w:r>
+        <w:t>Binary </w:t>
+      </w:r>
+    </w:p>
+    <w:p>
+      <w:pPr>
+        <w:rPr>
+          <w:rStyle w:val="Hyperlink"/>
+        </w:rPr>
+      </w:pPr>
+      <w:r>
+        <w:fldChar w:fldCharType="begin"/>
+      </w:r>
+      <w:r>
+        <w:instrText>HYPERLINK "https://files.slack.com/files-pri/T27SFGS2W-F0BKUTSSCLX/download/day9.txt?origin_team=E27SFGS2W" \t "_blank"</w:instrText>
+      </w:r>
+      <w:r>
+        <w:fldChar w:fldCharType="separate"/>
+      </w:r>
+    </w:p>
+    <w:p>
+      <w:pPr>
+        <w:rPr>
+          <w:rStyle w:val="Hyperlink"/>
+        </w:rPr>
+      </w:pPr>
+      <w:r>
+        <w:rPr>
+          <w:rStyle w:val="Hyperlink"/>
+        </w:rPr>
+        <w:t>Day9.txt</w:t>
+      </w:r>
+    </w:p>
+    <w:p>
+      <w:pPr>
+        <w:rPr>
+          <w:rStyle w:val="Hyperlink"/>
+        </w:rPr>
+      </w:pPr>
+      <w:r>
+        <w:rPr>
+          <w:rStyle w:val="Hyperlink"/>
+        </w:rPr>
+        <w:t>Binary</w:t>
+      </w:r>
+    </w:p>
+    <w:p>
+      <w:r>
+        <w:fldChar w:fldCharType="end"/>
+      </w:r>
+    </w:p>
+    <w:p>
+      <w:r>
+        <w:t xml:space="preserve">Md Ahsab </w:t>
+      </w:r>
+      <w:proofErr w:type="gramStart"/>
+      <w:r>
+        <w:t>Shiraz  [</w:t>
+      </w:r>
+      <w:proofErr w:type="gramEnd"/>
+      <w:r>
+        <w:t>10:12 AM]</w:t>
+      </w:r>
+    </w:p>
+    <w:p>
+      <w:r>
+        <w:t>Task 1:</w:t>
+      </w:r>
+      <w:r>
+        <w:br/>
+        <w:t>What is spring data JPA?</w:t>
+      </w:r>
+      <w:r>
+        <w:br/>
+        <w:t>Spring Data JPA is a module of the Spring Framework that makes it easy to work with databases using Java objects. Instead of writing long SQL queries, Spring Data JPA allows us to perform database operations like Insert, Update, Delete, and Fetch by simply creating repository interfaces. It is built on top of JPA (Java Persistence API) and usually uses Hibernate as the implementation.</w:t>
+      </w:r>
+      <w:r>
+        <w:br/>
+      </w:r>
+      <w:r>
+        <w:br/>
+        <w:t>Task 2:</w:t>
+      </w:r>
+      <w:r>
+        <w:br/>
+        <w:t>What are the key features of Spring data JPA?</w:t>
+      </w:r>
+      <w:r>
+        <w:br/>
+        <w:t>1. Less Boilerplate Code</w:t>
+      </w:r>
+      <w:r>
+        <w:br/>
+      </w:r>
+      <w:r>
+        <w:br/>
+        <w:t>No need to write repetitive SQL or JDBC code.</w:t>
+      </w:r>
+      <w:r>
+        <w:br/>
+      </w:r>
+      <w:r>
+        <w:br/>
+      </w:r>
+      <w:r>
+        <w:lastRenderedPageBreak/>
+        <w:t>2. Automatic CRUD Operations</w:t>
+      </w:r>
+      <w:r>
+        <w:br/>
+      </w:r>
+      <w:r>
+        <w:br/>
+        <w:t>Provides ready-made methods for Create, Read, Update, and Delete.</w:t>
+      </w:r>
+      <w:r>
+        <w:br/>
+      </w:r>
+      <w:r>
+        <w:br/>
+        <w:t>3. Query Methods</w:t>
+      </w:r>
+      <w:r>
+        <w:br/>
+      </w:r>
+      <w:r>
+        <w:br/>
+        <w:t>You can create queries just by writing method names.</w:t>
+      </w:r>
+      <w:r>
+        <w:br/>
+      </w:r>
+      <w:r>
+        <w:br/>
+        <w:t>Example:</w:t>
+      </w:r>
+      <w:r>
+        <w:br/>
+      </w:r>
+      <w:r>
+        <w:br/>
+      </w:r>
+      <w:proofErr w:type="spellStart"/>
+      <w:proofErr w:type="gramStart"/>
+      <w:r>
+        <w:t>findByName</w:t>
+      </w:r>
+      <w:proofErr w:type="spellEnd"/>
+      <w:r>
+        <w:t>(</w:t>
+      </w:r>
+      <w:proofErr w:type="gramEnd"/>
+      <w:r>
+        <w:t>String name)</w:t>
+      </w:r>
+      <w:r>
+        <w:br/>
+        <w:t>4. Pagination and Sorting</w:t>
+      </w:r>
+      <w:r>
+        <w:br/>
+      </w:r>
+      <w:r>
+        <w:br/>
+        <w:t>Supports dividing data into pages and sorting records easily.</w:t>
+      </w:r>
+      <w:r>
+        <w:br/>
+      </w:r>
+      <w:r>
+        <w:br/>
+        <w:t>5. Integration with Hibernate</w:t>
+      </w:r>
+      <w:r>
+        <w:br/>
+      </w:r>
+      <w:r>
+        <w:br/>
+        <w:t>Works smoothly with Hibernate and other JPA providers.</w:t>
+      </w:r>
+      <w:r>
+        <w:br/>
+      </w:r>
+      <w:r>
+        <w:br/>
+        <w:t>6. Transaction Management</w:t>
+      </w:r>
+      <w:r>
+        <w:br/>
+      </w:r>
+      <w:r>
+        <w:br/>
+        <w:t>Works with Spring's transaction management to ensure data consistency.</w:t>
+      </w:r>
+      <w:r>
+        <w:br/>
+      </w:r>
+      <w:r>
+        <w:br/>
+        <w:t>7. Custom Queries</w:t>
+      </w:r>
+      <w:r>
+        <w:br/>
+      </w:r>
+      <w:r>
+        <w:br/>
+        <w:t>Supports writing custom JPQL or native SQL queries using @Query.</w:t>
+      </w:r>
+      <w:r>
+        <w:br/>
+      </w:r>
+      <w:r>
+        <w:br/>
+      </w:r>
+      <w:r>
+        <w:br/>
+      </w:r>
+      <w:r>
+        <w:br/>
+      </w:r>
+      <w:r>
+        <w:br/>
+      </w:r>
+      <w:r>
+        <w:br/>
+        <w:t>Task 3:</w:t>
+      </w:r>
+      <w:r>
+        <w:br/>
+        <w:t>What are core components of Spring data JPA?</w:t>
+      </w:r>
+      <w:r>
+        <w:br/>
+        <w:t>1. Entity</w:t>
+      </w:r>
+      <w:r>
+        <w:br/>
+        <w:t>A Java class that represents a database table.</w:t>
+      </w:r>
+      <w:r>
+        <w:br/>
+        <w:t>Annotated with @Entity.</w:t>
+      </w:r>
+      <w:r>
+        <w:br/>
+        <w:t>2. Repository</w:t>
+      </w:r>
+      <w:r>
+        <w:br/>
+        <w:t>An interface used to perform database operations.</w:t>
+      </w:r>
+      <w:r>
+        <w:br/>
+        <w:t xml:space="preserve">Usually extends </w:t>
+      </w:r>
+      <w:proofErr w:type="spellStart"/>
+      <w:r>
+        <w:t>JpaRepository</w:t>
+      </w:r>
+      <w:proofErr w:type="spellEnd"/>
+      <w:r>
+        <w:t>.</w:t>
+      </w:r>
+      <w:r>
+        <w:br/>
+        <w:t>3. JPA (Java Persistence API)</w:t>
+      </w:r>
+      <w:r>
+        <w:br/>
+        <w:t>A specification that defines how Java objects are stored and retrieved from a database.</w:t>
+      </w:r>
+      <w:r>
+        <w:br/>
+      </w:r>
+      <w:r>
+        <w:lastRenderedPageBreak/>
+        <w:t xml:space="preserve">Hibernate is the </w:t>
+      </w:r>
+      <w:proofErr w:type="gramStart"/>
+      <w:r>
+        <w:t>most commonly used</w:t>
+      </w:r>
+      <w:proofErr w:type="gramEnd"/>
+      <w:r>
+        <w:t xml:space="preserve"> implementation.</w:t>
+      </w:r>
+      <w:r>
+        <w:br/>
+        <w:t>4. Hibernate</w:t>
+      </w:r>
+      <w:r>
+        <w:br/>
+        <w:t>The JPA implementation.</w:t>
+      </w:r>
+      <w:r>
+        <w:br/>
+        <w:t>Converts Java objects into database records and vice versa.</w:t>
+      </w:r>
+      <w:r>
+        <w:br/>
+        <w:t>5. Database</w:t>
+      </w:r>
+      <w:r>
+        <w:br/>
+        <w:t>Stores the application's data.</w:t>
+      </w:r>
+      <w:r>
+        <w:br/>
+        <w:t>Examples: MySQL, PostgreSQL, Oracle, SQL Server.</w:t>
+      </w:r>
+      <w:r>
+        <w:br/>
+      </w:r>
+      <w:r>
+        <w:br/>
+      </w:r>
+      <w:r>
+        <w:rPr>
+          <w:b/>
+          <w:bCs/>
+        </w:rPr>
+        <w:t>Task 4:</w:t>
+      </w:r>
+      <w:r>
+        <w:br/>
+        <w:t>Now create a spring application using initializer</w:t>
+      </w:r>
+      <w:r>
+        <w:br/>
+        <w:t>Create a customer entity with id and account type</w:t>
+      </w:r>
+      <w:r>
+        <w:br/>
+        <w:t>Done</w:t>
+      </w:r>
+      <w:r>
+        <w:br/>
+      </w:r>
+      <w:r>
+        <w:br/>
+      </w:r>
+      <w:r>
+        <w:rPr>
+          <w:b/>
+          <w:bCs/>
+        </w:rPr>
+        <w:t>Task 5:</w:t>
+      </w:r>
+      <w:r>
+        <w:br/>
+        <w:t>Add this interface to your above code</w:t>
+      </w:r>
+      <w:r>
+        <w:br/>
+      </w:r>
+      <w:r>
+        <w:br/>
+      </w:r>
+      <w:r>
+        <w:br/>
+      </w:r>
+      <w:r>
+        <w:br/>
+      </w:r>
+      <w:r>
+        <w:br/>
+      </w:r>
+      <w:r>
+        <w:br/>
+      </w:r>
+      <w:r>
+        <w:rPr>
+          <w:b/>
+          <w:bCs/>
+        </w:rPr>
+        <w:t>Task 6:</w:t>
+      </w:r>
+      <w:r>
+        <w:br/>
+        <w:t xml:space="preserve">What is </w:t>
+      </w:r>
+      <w:proofErr w:type="spellStart"/>
+      <w:r>
+        <w:t>Application.proteries</w:t>
+      </w:r>
+      <w:proofErr w:type="spellEnd"/>
+      <w:r>
+        <w:t xml:space="preserve"> file is about?</w:t>
+      </w:r>
+      <w:r>
+        <w:br/>
+        <w:t xml:space="preserve">The </w:t>
+      </w:r>
+      <w:proofErr w:type="spellStart"/>
+      <w:r>
+        <w:t>application.properties</w:t>
+      </w:r>
+      <w:proofErr w:type="spellEnd"/>
+      <w:r>
+        <w:t xml:space="preserve"> file is the main configuration file in a Spring Boot application.</w:t>
+      </w:r>
+      <w:r>
+        <w:br/>
+      </w:r>
+      <w:r>
+        <w:br/>
+        <w:t>It stores all the important settings needed for the application, such as:</w:t>
+      </w:r>
+      <w:r>
+        <w:br/>
+      </w:r>
+      <w:r>
+        <w:br/>
+        <w:t>Server port</w:t>
+      </w:r>
+      <w:r>
+        <w:br/>
+        <w:t>Database connection</w:t>
+      </w:r>
+      <w:r>
+        <w:br/>
+        <w:t>Application name</w:t>
+      </w:r>
+      <w:r>
+        <w:br/>
+        <w:t>Logging settings</w:t>
+      </w:r>
+      <w:r>
+        <w:br/>
+        <w:t>Security settings</w:t>
+      </w:r>
+      <w:r>
+        <w:br/>
+      </w:r>
+      <w:r>
+        <w:br/>
+      </w:r>
+      <w:r>
+        <w:rPr>
+          <w:b/>
+          <w:bCs/>
+        </w:rPr>
+        <w:t>Task 7:</w:t>
+      </w:r>
+      <w:r>
+        <w:rPr>
+          <w:b/>
+          <w:bCs/>
+        </w:rPr>
+        <w:br/>
+      </w:r>
+      <w:r>
+        <w:t>Why use application properties… uses?</w:t>
+      </w:r>
+      <w:r>
+        <w:br/>
+        <w:t xml:space="preserve">We use </w:t>
+      </w:r>
+      <w:proofErr w:type="spellStart"/>
+      <w:r>
+        <w:t>application.properties</w:t>
+      </w:r>
+      <w:proofErr w:type="spellEnd"/>
+      <w:r>
+        <w:t xml:space="preserve"> to configure our application without changing the Java code.</w:t>
+      </w:r>
+      <w:r>
+        <w:br/>
+      </w:r>
+      <w:r>
+        <w:br/>
+        <w:t>Uses</w:t>
+      </w:r>
+      <w:r>
+        <w:br/>
+        <w:t>Set the application name</w:t>
+      </w:r>
+      <w:r>
+        <w:br/>
+        <w:t>Change the server port</w:t>
+      </w:r>
+      <w:r>
+        <w:br/>
+        <w:t>Connect to a database</w:t>
+      </w:r>
+      <w:r>
+        <w:br/>
+      </w:r>
+      <w:r>
+        <w:lastRenderedPageBreak/>
+        <w:t>Configure logging</w:t>
+      </w:r>
+      <w:r>
+        <w:br/>
+        <w:t>Enable H2 Database</w:t>
+      </w:r>
+      <w:r>
+        <w:br/>
+        <w:t>Store custom values</w:t>
+      </w:r>
+      <w:r>
+        <w:br/>
+      </w:r>
+      <w:r>
+        <w:rPr>
+          <w:b/>
+          <w:bCs/>
+        </w:rPr>
+        <w:br/>
+        <w:t>Task 8:</w:t>
+      </w:r>
+      <w:r>
+        <w:br/>
+        <w:t xml:space="preserve">What is </w:t>
+      </w:r>
+      <w:proofErr w:type="spellStart"/>
+      <w:r>
+        <w:t>application.yml</w:t>
+      </w:r>
+      <w:proofErr w:type="spellEnd"/>
+      <w:r>
+        <w:t>?</w:t>
+      </w:r>
+      <w:r>
+        <w:br/>
+      </w:r>
+      <w:proofErr w:type="spellStart"/>
+      <w:r>
+        <w:t>application.yml</w:t>
+      </w:r>
+      <w:proofErr w:type="spellEnd"/>
+      <w:r>
+        <w:t xml:space="preserve"> is just another way of writing application settings. It organizes the settings in a cleaner and more readable format</w:t>
+      </w:r>
+      <w:r>
+        <w:br/>
+      </w:r>
+      <w:r>
+        <w:br/>
+      </w:r>
+      <w:r>
+        <w:rPr>
+          <w:b/>
+          <w:bCs/>
+        </w:rPr>
+        <w:t>Task 9:</w:t>
+      </w:r>
+      <w:r>
+        <w:br/>
+        <w:t xml:space="preserve">Why use/prefer to use  </w:t>
+      </w:r>
+      <w:proofErr w:type="spellStart"/>
+      <w:r>
+        <w:t>application.yml</w:t>
+      </w:r>
+      <w:proofErr w:type="spellEnd"/>
+      <w:r>
+        <w:t xml:space="preserve"> instead of </w:t>
+      </w:r>
+      <w:proofErr w:type="spellStart"/>
+      <w:r>
+        <w:t>application.properties</w:t>
+      </w:r>
+      <w:proofErr w:type="spellEnd"/>
+      <w:r>
+        <w:t>?</w:t>
+      </w:r>
+      <w:r>
+        <w:br/>
+        <w:t>For small projects, both files work well.</w:t>
+      </w:r>
+      <w:r>
+        <w:br/>
+      </w:r>
+      <w:r>
+        <w:br/>
+        <w:t xml:space="preserve">For large projects, many developers prefer </w:t>
+      </w:r>
+      <w:proofErr w:type="spellStart"/>
+      <w:r>
+        <w:t>application.yml</w:t>
+      </w:r>
+      <w:proofErr w:type="spellEnd"/>
+      <w:r>
+        <w:t xml:space="preserve"> because it is easier to read and organize.</w:t>
+      </w:r>
+      <w:r>
+        <w:br/>
+      </w:r>
+      <w:r>
+        <w:br/>
+      </w:r>
+      <w:r>
+        <w:rPr>
+          <w:b/>
+          <w:bCs/>
+        </w:rPr>
+        <w:t>Task 10:</w:t>
+      </w:r>
+      <w:r>
+        <w:br/>
+        <w:t>What is Eureka Server?</w:t>
+      </w:r>
+      <w:r>
+        <w:br/>
+        <w:t>Eureka Server is a service registry used in Spring Boot Microservices.</w:t>
+      </w:r>
+      <w:r>
+        <w:br/>
+      </w:r>
+      <w:r>
+        <w:br/>
+        <w:t>It keeps a list of all the microservices running in an application.</w:t>
+      </w:r>
+      <w:r>
+        <w:br/>
+      </w:r>
+      <w:r>
+        <w:br/>
+        <w:t>When a microservice starts, it registers itself with the Eureka Server.</w:t>
+      </w:r>
+      <w:r>
+        <w:br/>
+      </w:r>
+      <w:r>
+        <w:br/>
+        <w:t>When another microservice wants to communicate with it, it asks Eureka Server for its location.</w:t>
+      </w:r>
+      <w:r>
+        <w:br/>
+      </w:r>
+      <w:r>
+        <w:br/>
+      </w:r>
+      <w:r>
+        <w:rPr>
+          <w:b/>
+          <w:bCs/>
+        </w:rPr>
+        <w:t>Task 11:</w:t>
+      </w:r>
+      <w:r>
+        <w:br/>
+        <w:t>Purpose of Eureka Server.</w:t>
+      </w:r>
+      <w:r>
+        <w:br/>
+        <w:t>Eureka Server acts like a directory or contact list. Instead of remembering everyone's phone number, you simply look it up in the directory. Likewise, microservices ask Eureka Server where another service is located before communicating with it</w:t>
+      </w:r>
+      <w:r>
+        <w:br/>
+      </w:r>
+      <w:r>
+        <w:br/>
+      </w:r>
+      <w:r>
+        <w:rPr>
+          <w:b/>
+          <w:bCs/>
+        </w:rPr>
+        <w:br/>
+      </w:r>
+      <w:r>
+        <w:rPr>
+          <w:b/>
+          <w:bCs/>
+        </w:rPr>
+        <w:t>Home Task</w:t>
+      </w:r>
+      <w:r>
+        <w:rPr>
+          <w:b/>
+          <w:bCs/>
+        </w:rPr>
+        <w:br/>
+      </w:r>
+      <w:r>
+        <w:br/>
+      </w:r>
+      <w:r>
+        <w:br/>
+      </w:r>
+      <w:r>
+        <w:br/>
+      </w:r>
+      <w:proofErr w:type="spellStart"/>
+      <w:r>
+        <w:rPr>
+          <w:b/>
+          <w:bCs/>
+        </w:rPr>
+        <w:t>Task</w:t>
+      </w:r>
+      <w:proofErr w:type="spellEnd"/>
+      <w:r>
+        <w:rPr>
+          <w:b/>
+          <w:bCs/>
+        </w:rPr>
+        <w:t xml:space="preserve"> 1:</w:t>
+      </w:r>
+      <w:r>
+        <w:br/>
+        <w:t>What do you know about Spring MVC framework?</w:t>
+      </w:r>
+      <w:r>
+        <w:br/>
+        <w:t xml:space="preserve">Spring MVC is a framework used to build Java web applications like banking websites, </w:t>
+      </w:r>
+      <w:r>
+        <w:lastRenderedPageBreak/>
+        <w:t>shopping websites, or student management systems.</w:t>
+      </w:r>
+      <w:r>
+        <w:br/>
+      </w:r>
+      <w:r>
+        <w:br/>
+        <w:t>It follows the MVC (Model-View-Controller) pattern, which divides the application into three parts so the code is clean and easy to manage.</w:t>
+      </w:r>
+      <w:r>
+        <w:br/>
+      </w:r>
+      <w:r>
+        <w:br/>
+        <w:t>Model → Stores and manages the data.</w:t>
+      </w:r>
+      <w:r>
+        <w:br/>
+        <w:t>View → Shows the data to the user (web page).</w:t>
+      </w:r>
+      <w:r>
+        <w:br/>
+        <w:t>Controller → Receives the user's request, processes it, and decides what to show.</w:t>
+      </w:r>
+      <w:r>
+        <w:br/>
+      </w:r>
+      <w:r>
+        <w:br/>
+      </w:r>
+      <w:r>
+        <w:rPr>
+          <w:b/>
+          <w:bCs/>
+        </w:rPr>
+        <w:t>Task 2:</w:t>
+      </w:r>
+      <w:r>
+        <w:br/>
+        <w:t>What is Dispatcher Servlet?</w:t>
+      </w:r>
+      <w:r>
+        <w:br/>
+        <w:t>Dispatcher Servlet is the main controller of Spring MVC.</w:t>
+      </w:r>
+      <w:r>
+        <w:br/>
+      </w:r>
+      <w:r>
+        <w:br/>
+        <w:t>It receives every request from the user and sends it to the correct controller. After the controller finishes its work, the Dispatcher Servlet sends the response back to the user.</w:t>
+      </w:r>
+      <w:r>
+        <w:br/>
+      </w:r>
+      <w:r>
+        <w:br/>
+      </w:r>
+      <w:r>
+        <w:rPr>
+          <w:b/>
+          <w:bCs/>
+        </w:rPr>
+        <w:t>Task 3:</w:t>
+      </w:r>
+      <w:r>
+        <w:br/>
+        <w:t>Can you explain Spring MVC with diagram</w:t>
+      </w:r>
+      <w:r>
+        <w:br/>
+      </w:r>
+      <w:r>
+        <w:br/>
+        <w:t>        User (Browser)</w:t>
+      </w:r>
+      <w:r>
+        <w:br/>
+        <w:t>              |</w:t>
+      </w:r>
+      <w:r>
+        <w:br/>
+        <w:t>              | Request</w:t>
+      </w:r>
+      <w:r>
+        <w:br/>
+        <w:t>              </w:t>
+      </w:r>
+      <w:r>
+        <w:rPr>
+          <w:rFonts w:ascii="Arial" w:hAnsi="Arial" w:cs="Arial"/>
+        </w:rPr>
+        <w:t>▼</w:t>
+      </w:r>
+      <w:r>
+        <w:br/>
+      </w:r>
+      <w:r>
+        <w:rPr>
+          <w:rFonts w:ascii="Aptos" w:hAnsi="Aptos" w:cs="Aptos"/>
+        </w:rPr>
+        <w:t>     </w:t>
+      </w:r>
+      <w:r>
+        <w:t>Dispatcher Servlet</w:t>
+      </w:r>
+      <w:r>
+        <w:br/>
+      </w:r>
+      <w:r>
+        <w:rPr>
+          <w:rFonts w:ascii="Aptos" w:hAnsi="Aptos" w:cs="Aptos"/>
+        </w:rPr>
+        <w:t>              </w:t>
+      </w:r>
+      <w:r>
+        <w:t>|</w:t>
+      </w:r>
+      <w:r>
+        <w:br/>
+      </w:r>
+      <w:r>
+        <w:rPr>
+          <w:rFonts w:ascii="Aptos" w:hAnsi="Aptos" w:cs="Aptos"/>
+        </w:rPr>
+        <w:t>              </w:t>
+      </w:r>
+      <w:r>
+        <w:rPr>
+          <w:rFonts w:ascii="Arial" w:hAnsi="Arial" w:cs="Arial"/>
+        </w:rPr>
+        <w:t>▼</w:t>
+      </w:r>
+      <w:r>
+        <w:br/>
+      </w:r>
+      <w:r>
+        <w:rPr>
+          <w:rFonts w:ascii="Aptos" w:hAnsi="Aptos" w:cs="Aptos"/>
+        </w:rPr>
+        <w:t>         </w:t>
+      </w:r>
+      <w:r>
+        <w:t>Controller</w:t>
+      </w:r>
+      <w:r>
+        <w:br/>
+      </w:r>
+      <w:r>
+        <w:rPr>
+          <w:rFonts w:ascii="Aptos" w:hAnsi="Aptos" w:cs="Aptos"/>
+        </w:rPr>
+        <w:t>              </w:t>
+      </w:r>
+      <w:r>
+        <w:t>|</w:t>
+      </w:r>
+      <w:r>
+        <w:br/>
+      </w:r>
+      <w:r>
+        <w:rPr>
+          <w:rFonts w:ascii="Aptos" w:hAnsi="Aptos" w:cs="Aptos"/>
+        </w:rPr>
+        <w:t>              </w:t>
+      </w:r>
+      <w:r>
+        <w:rPr>
+          <w:rFonts w:ascii="Arial" w:hAnsi="Arial" w:cs="Arial"/>
+        </w:rPr>
+        <w:t>▼</w:t>
+      </w:r>
+      <w:r>
+        <w:br/>
+        <w:t>      Model (Data/Database)</w:t>
+      </w:r>
+      <w:r>
+        <w:br/>
+        <w:t>              |</w:t>
+      </w:r>
+      <w:r>
+        <w:br/>
+        <w:t>              </w:t>
+      </w:r>
+      <w:r>
+        <w:rPr>
+          <w:rFonts w:ascii="Arial" w:hAnsi="Arial" w:cs="Arial"/>
+        </w:rPr>
+        <w:t>▼</w:t>
+      </w:r>
+      <w:r>
+        <w:br/>
+      </w:r>
+      <w:r>
+        <w:rPr>
+          <w:rFonts w:ascii="Aptos" w:hAnsi="Aptos" w:cs="Aptos"/>
+        </w:rPr>
+        <w:t>           </w:t>
+      </w:r>
+      <w:r>
+        <w:t>Controller</w:t>
+      </w:r>
+      <w:r>
+        <w:br/>
+      </w:r>
+      <w:r>
+        <w:rPr>
+          <w:rFonts w:ascii="Aptos" w:hAnsi="Aptos" w:cs="Aptos"/>
+        </w:rPr>
+        <w:t>              </w:t>
+      </w:r>
+      <w:r>
+        <w:t>|</w:t>
+      </w:r>
+      <w:r>
+        <w:br/>
+      </w:r>
+      <w:r>
+        <w:rPr>
+          <w:rFonts w:ascii="Aptos" w:hAnsi="Aptos" w:cs="Aptos"/>
+        </w:rPr>
+        <w:t>              </w:t>
+      </w:r>
+      <w:r>
+        <w:rPr>
+          <w:rFonts w:ascii="Arial" w:hAnsi="Arial" w:cs="Arial"/>
+        </w:rPr>
+        <w:t>▼</w:t>
+      </w:r>
+      <w:r>
+        <w:br/>
+      </w:r>
+      <w:r>
+        <w:rPr>
+          <w:rFonts w:ascii="Aptos" w:hAnsi="Aptos" w:cs="Aptos"/>
+        </w:rPr>
+        <w:t>             </w:t>
+      </w:r>
+      <w:r>
+        <w:t>View</w:t>
+      </w:r>
+      <w:r>
+        <w:br/>
+      </w:r>
+      <w:r>
+        <w:rPr>
+          <w:rFonts w:ascii="Aptos" w:hAnsi="Aptos" w:cs="Aptos"/>
+        </w:rPr>
+        <w:t>              </w:t>
+      </w:r>
+      <w:r>
+        <w:t>|</w:t>
+      </w:r>
+      <w:r>
+        <w:br/>
+      </w:r>
+      <w:r>
+        <w:rPr>
+          <w:rFonts w:ascii="Aptos" w:hAnsi="Aptos" w:cs="Aptos"/>
+        </w:rPr>
+        <w:t>              </w:t>
+      </w:r>
+      <w:r>
+        <w:rPr>
+          <w:rFonts w:ascii="Arial" w:hAnsi="Arial" w:cs="Arial"/>
+        </w:rPr>
+        <w:t>▼</w:t>
+      </w:r>
+      <w:r>
+        <w:br/>
+      </w:r>
+      <w:r>
+        <w:rPr>
+          <w:rFonts w:ascii="Aptos" w:hAnsi="Aptos" w:cs="Aptos"/>
+        </w:rPr>
+        <w:t>      </w:t>
+      </w:r>
+      <w:r>
+        <w:t>Response to User</w:t>
+      </w:r>
+      <w:r>
+        <w:br/>
+      </w:r>
+      <w:r>
+        <w:br/>
+        <w:t>Spring MVC is a framework used to build Java web applications. It follows the Model-</w:t>
+      </w:r>
+      <w:r>
+        <w:lastRenderedPageBreak/>
+        <w:t>View-Controller pattern, where the Controller handles requests, the Model manages data, and the View displays the result to the user.</w:t>
+      </w:r>
+    </w:p>
+    <w:p/>
     <w:sectPr>
       <w:pgSz w:w="11906" w:h="16838"/>
       <w:pgMar w:top="1440" w:right="1440" w:bottom="1440" w:left="1440" w:header="708" w:footer="708" w:gutter="0"/>
@@ -1214,6 +3335,29 @@
       <w:spacing w:val="5"/>
     </w:rPr>
   </w:style>
+  <w:style w:type="character" w:styleId="Hyperlink">
+    <w:name w:val="Hyperlink"/>
+    <w:basedOn w:val="DefaultParagraphFont"/>
+    <w:uiPriority w:val="99"/>
+    <w:unhideWhenUsed/>
+    <w:rsid w:val="00301EAF"/>
+    <w:rPr>
+      <w:color w:val="467886" w:themeColor="hyperlink"/>
+      <w:u w:val="single"/>
+    </w:rPr>
+  </w:style>
+  <w:style w:type="character" w:styleId="UnresolvedMention">
+    <w:name w:val="Unresolved Mention"/>
+    <w:basedOn w:val="DefaultParagraphFont"/>
+    <w:uiPriority w:val="99"/>
+    <w:semiHidden/>
+    <w:unhideWhenUsed/>
+    <w:rsid w:val="00301EAF"/>
+    <w:rPr>
+      <w:color w:val="605E5C"/>
+      <w:shd w:val="clear" w:color="auto" w:fill="E1DFDD"/>
+    </w:rPr>
+  </w:style>
 </w:styles>
 </file>
 

</xml_diff>